<commit_message>
Update stable Flask app for Render deploy
</commit_message>
<xml_diff>
--- a/uploads/10_bai_toan_loi_van_lop_4.docx
+++ b/uploads/10_bai_toan_loi_van_lop_4.docx
@@ -3,36 +3,336 @@
 <w:document xmlns:wpc="http://schemas.microsoft.com/office/word/2010/wordprocessingCanvas" xmlns:cx="http://schemas.microsoft.com/office/drawing/2014/chartex" xmlns:cx1="http://schemas.microsoft.com/office/drawing/2015/9/8/chartex" xmlns:cx2="http://schemas.microsoft.com/office/drawing/2015/10/21/chartex" xmlns:cx3="http://schemas.microsoft.com/office/drawing/2016/5/9/chartex" xmlns:cx4="http://schemas.microsoft.com/office/drawing/2016/5/10/chartex" xmlns:cx5="http://schemas.microsoft.com/office/drawing/2016/5/11/chartex" xmlns:cx6="http://schemas.microsoft.com/office/drawing/2016/5/12/chartex" xmlns:cx7="http://schemas.microsoft.com/office/drawing/2016/5/13/chartex" xmlns:cx8="http://schemas.microsoft.com/office/drawing/2016/5/14/chartex" xmlns:mc="http://schemas.openxmlformats.org/markup-compatibility/2006" xmlns:aink="http://schemas.microsoft.com/office/drawing/2016/ink" xmlns:am3d="http://schemas.microsoft.com/office/drawing/2017/model3d" xmlns:o="urn:schemas-microsoft-com:office:office" xmlns:oel="http://schemas.microsoft.com/office/2019/extlst" xmlns:r="http://schemas.openxmlformats.org/officeDocument/2006/relationships" xmlns:m="http://schemas.openxmlformats.org/officeDocument/2006/math" xmlns:v="urn:schemas-microsoft-com:vml" xmlns:wp14="http://schemas.microsoft.com/office/word/2010/wordprocessingDrawing" xmlns:wp="http://schemas.openxmlformats.org/drawingml/2006/wordprocessingDrawing" xmlns:w10="urn:schemas-microsoft-com:office:word" xmlns:w="http://schemas.openxmlformats.org/wordprocessingml/2006/main" xmlns:w14="http://schemas.microsoft.com/office/word/2010/wordml" xmlns:w15="http://schemas.microsoft.com/office/word/2012/wordml" xmlns:w16cex="http://schemas.microsoft.com/office/word/2018/wordml/cex" xmlns:w16cid="http://schemas.microsoft.com/office/word/2016/wordml/cid" xmlns:w16="http://schemas.microsoft.com/office/word/2018/wordml" xmlns:w16du="http://schemas.microsoft.com/office/word/2023/wordml/word16du" xmlns:w16sdtdh="http://schemas.microsoft.com/office/word/2020/wordml/sdtdatahash" xmlns:w16sdtfl="http://schemas.microsoft.com/office/word/2024/wordml/sdtformatlock" xmlns:w16se="http://schemas.microsoft.com/office/word/2015/wordml/symex" xmlns:wpg="http://schemas.microsoft.com/office/word/2010/wordprocessingGroup" xmlns:wpi="http://schemas.microsoft.com/office/word/2010/wordprocessingInk" xmlns:wne="http://schemas.microsoft.com/office/word/2006/wordml" xmlns:wps="http://schemas.microsoft.com/office/word/2010/wordprocessingShape" mc:Ignorable="w14 w15 w16se w16cid w16 w16cex w16sdtdh w16sdtfl w16du wp14">
   <w:body>
     <w:p>
-      <w:pPr>
-        <w:pStyle w:val="Heading1"/>
-      </w:pPr>
-      <w:r>
-        <w:t>10 BÀI TOÁN LỜI VĂN - TOÁN 4</w:t>
+      <w:r>
+        <w:t>[BÀI TOÁN]</w:t>
       </w:r>
     </w:p>
     <w:p>
       <w:r>
-        <w:t>[BÀI TOÁN]</w:t>
+        <w:t>Một cửa hàng có 8 thùng gạo, mỗi thùng đựng 25 kg gạo. Hỏi cửa hàng đó có tất cả bao nhiêu ki-lô-gam gạo?</w:t>
       </w:r>
     </w:p>
     <w:p>
       <w:r>
-        <w:t>Một cửa hàng có 8 thùng gạo, mỗi thùng đựng 25 kg gạo. Hỏi cửa hàng đó có tất cả bao nhiêu ki-lô-gam gạo?</w:t>
+        <w:t>[ĐÁP ÁN MẪU]</w:t>
       </w:r>
     </w:p>
     <w:p>
       <w:r>
+        <w:t>Số gạo trong 8 thùng là: 25 × 8 = 200 (kg).</w:t>
+      </w:r>
+      <w:r>
+        <w:br/>
+        <w:t>Đáp số: 200 kg.</w:t>
+      </w:r>
+    </w:p>
+    <w:p>
+      <w:r>
+        <w:t>[ĐÁP SỐ]</w:t>
+      </w:r>
+    </w:p>
+    <w:p>
+      <w:r>
+        <w:t>200</w:t>
+      </w:r>
+    </w:p>
+    <w:p>
+      <w:r>
+        <w:t>[BÀI TOÁN]</w:t>
+      </w:r>
+    </w:p>
+    <w:p>
+      <w:r>
+        <w:t>Ba bạn chia đều 36 quyển vở. Hỏi mỗi bạn được mấy quyển vở?</w:t>
+      </w:r>
+    </w:p>
+    <w:p>
+      <w:r>
+        <w:t>[ĐÁP ÁN MẪU]</w:t>
+      </w:r>
+    </w:p>
+    <w:p>
+      <w:r>
+        <w:t>Mỗi bạn được số vở là: 36 : 3 = 12 (quyển).</w:t>
+      </w:r>
+      <w:r>
+        <w:br/>
+        <w:t>Đáp số: 12 quyển.</w:t>
+      </w:r>
+    </w:p>
+    <w:p>
+      <w:r>
+        <w:t>[ĐÁP SỐ]</w:t>
+      </w:r>
+    </w:p>
+    <w:p>
+      <w:r>
+        <w:t>12</w:t>
+      </w:r>
+    </w:p>
+    <w:p>
+      <w:r>
+        <w:t>[BÀI TOÁN]</w:t>
+      </w:r>
+    </w:p>
+    <w:p>
+      <w:r>
+        <w:t>Một đội công nhân làm xong 48m đường trong 6 ngày. Hỏi trung bình mỗi ngày đội đó làm được bao nhiêu mét đường?</w:t>
+      </w:r>
+    </w:p>
+    <w:p>
+      <w:r>
+        <w:t>[ĐÁP ÁN MẪU]</w:t>
+      </w:r>
+    </w:p>
+    <w:p>
+      <w:r>
+        <w:t>Mỗi ngày làm được: 48 : 6 = 8 (m).</w:t>
+      </w:r>
+      <w:r>
+        <w:br/>
+        <w:t>Đáp số: 8 mét.</w:t>
+      </w:r>
+    </w:p>
+    <w:p>
+      <w:r>
+        <w:t>[ĐÁP SỐ]</w:t>
+      </w:r>
+    </w:p>
+    <w:p>
+      <w:r>
+        <w:t>8</w:t>
+      </w:r>
+    </w:p>
+    <w:p>
+      <w:r>
+        <w:t>[BÀI TOÁN]</w:t>
+      </w:r>
+    </w:p>
+    <w:p>
+      <w:r>
+        <w:t>Mua 4 hộp sữa, mỗi hộp giá 8 000 đồng. Hỏi mua tất cả hết bao nhiêu tiền?</w:t>
+      </w:r>
+    </w:p>
+    <w:p>
+      <w:r>
+        <w:t>[ĐÁP ÁN MẪU]</w:t>
+      </w:r>
+    </w:p>
+    <w:p>
+      <w:r>
+        <w:t>Tổng số tiền phải trả là: 8 000 × 4 = 32 000 (đồng).</w:t>
+      </w:r>
+      <w:r>
+        <w:br/>
+        <w:t>Đáp số: 32 000 đồng.</w:t>
+      </w:r>
+    </w:p>
+    <w:p>
+      <w:r>
+        <w:lastRenderedPageBreak/>
+        <w:t>[ĐÁP SỐ]</w:t>
+      </w:r>
+    </w:p>
+    <w:p>
+      <w:r>
+        <w:t>32000</w:t>
+      </w:r>
+    </w:p>
+    <w:p>
+      <w:r>
+        <w:t>[BÀI TOÁN]</w:t>
+      </w:r>
+    </w:p>
+    <w:p>
+      <w:r>
+        <w:t>Có 5 bao đường, mỗi bao nặng 25 kg. Hỏi tất cả số đường đó nặng bao nhiêu ki-lô-gam?</w:t>
+      </w:r>
+    </w:p>
+    <w:p>
+      <w:r>
+        <w:t>[ĐÁP ÁN MẪU]</w:t>
+      </w:r>
+    </w:p>
+    <w:p>
+      <w:r>
+        <w:t>Tổng số ki-lô-gam đường là: 25 × 5 = 125 (kg).</w:t>
+      </w:r>
+      <w:r>
+        <w:br/>
+        <w:t>Đáp số: 125 kg.</w:t>
+      </w:r>
+    </w:p>
+    <w:p>
+      <w:r>
+        <w:t>[ĐÁP SỐ]</w:t>
+      </w:r>
+    </w:p>
+    <w:p>
+      <w:r>
+        <w:t>125</w:t>
+      </w:r>
+    </w:p>
+    <w:p>
+      <w:r>
+        <w:t>[BÀI TOÁN]</w:t>
+      </w:r>
+    </w:p>
+    <w:p>
+      <w:r>
+        <w:t>Một tấm vải dài 27m, người ta cắt thành 9 đoạn bằng nhau. Hỏi mỗi đoạn dài bao nhiêu mét?</w:t>
+      </w:r>
+    </w:p>
+    <w:p>
+      <w:r>
+        <w:t>[ĐÁP ÁN MẪU]</w:t>
+      </w:r>
+    </w:p>
+    <w:p>
+      <w:r>
+        <w:t>Chiều dài mỗi đoạn là: 27 : 9 = 3 (m).</w:t>
+      </w:r>
+      <w:r>
+        <w:br/>
+        <w:t>Đáp số: 3 mét.</w:t>
+      </w:r>
+    </w:p>
+    <w:p>
+      <w:r>
+        <w:t>[ĐÁP SỐ]</w:t>
+      </w:r>
+    </w:p>
+    <w:p>
+      <w:r>
+        <w:t>3</w:t>
+      </w:r>
+    </w:p>
+    <w:p>
+      <w:r>
+        <w:t>[BÀI TOÁN]</w:t>
+      </w:r>
+    </w:p>
+    <w:p>
+      <w:r>
+        <w:t>Mỗi cuốn sách giá 15 000 đồng. Lan mua 6 cuốn. Hỏi Lan phải trả bao nhiêu tiền?</w:t>
+      </w:r>
+    </w:p>
+    <w:p>
+      <w:r>
+        <w:t>[ĐÁP ÁN MẪU]</w:t>
+      </w:r>
+    </w:p>
+    <w:p>
+      <w:r>
+        <w:t>Số tiền Lan phải trả là: 15 000 × 6 = 90 000 (đồng).</w:t>
+      </w:r>
+      <w:r>
+        <w:br/>
+        <w:t>Đáp số: 90 000 đồng.</w:t>
+      </w:r>
+    </w:p>
+    <w:p>
+      <w:r>
+        <w:t>[ĐÁP SỐ]</w:t>
+      </w:r>
+    </w:p>
+    <w:p>
+      <w:r>
+        <w:t>90000</w:t>
+      </w:r>
+    </w:p>
+    <w:p>
+      <w:r>
+        <w:t>[BÀI TOÁN]</w:t>
+      </w:r>
+    </w:p>
+    <w:p>
+      <w:r>
+        <w:t>Một chiếc ô tô đi được 120 km trong 3 giờ. Hỏi trung bình mỗi giờ ô tô đi được bao nhiêu ki-lô-mét?</w:t>
+      </w:r>
+    </w:p>
+    <w:p>
+      <w:r>
+        <w:t>[ĐÁP ÁN MẪU]</w:t>
+      </w:r>
+    </w:p>
+    <w:p>
+      <w:r>
+        <w:lastRenderedPageBreak/>
+        <w:t>Mỗi giờ ô tô đi được: 120 : 3 = 40 (km).</w:t>
+      </w:r>
+      <w:r>
+        <w:br/>
+        <w:t>Đáp số: 40 km.</w:t>
+      </w:r>
+    </w:p>
+    <w:p>
+      <w:r>
+        <w:t>[ĐÁP SỐ]</w:t>
+      </w:r>
+    </w:p>
+    <w:p>
+      <w:r>
+        <w:t>40</w:t>
+      </w:r>
+    </w:p>
+    <w:p>
+      <w:r>
+        <w:t>[BÀI TOÁN]</w:t>
+      </w:r>
+    </w:p>
+    <w:p>
+      <w:r>
+        <w:t>Một cửa hàng bán 6 hộp bánh, mỗi hộp có 12 cái bánh. Hỏi cửa hàng có tất cả bao nhiêu cái bánh?</w:t>
+      </w:r>
+    </w:p>
+    <w:p>
+      <w:r>
+        <w:t>[ĐÁP ÁN MẪU]</w:t>
+      </w:r>
+    </w:p>
+    <w:p>
+      <w:r>
+        <w:t>Tổng số bánh là: 12 × 6 = 72 (cái).</w:t>
+      </w:r>
+      <w:r>
+        <w:br/>
+        <w:t>Đáp số: 72 cái.</w:t>
+      </w:r>
+    </w:p>
+    <w:p>
+      <w:r>
+        <w:t>[ĐÁP SỐ]</w:t>
+      </w:r>
+    </w:p>
+    <w:p>
+      <w:r>
+        <w:t>72</w:t>
+      </w:r>
+    </w:p>
+    <w:p>
+      <w:r>
+        <w:t>[BÀI TOÁN]</w:t>
+      </w:r>
+    </w:p>
+    <w:p>
+      <w:r>
+        <w:t>Một gói bút có 10 cây. Cửa hàng nhập về 25 gói bút. Hỏi cửa hàng có tất cả bao nhiêu cây bút?</w:t>
+      </w:r>
+    </w:p>
+    <w:p>
+      <w:r>
         <w:br/>
         <w:t>[ĐÁP ÁN MẪU]</w:t>
       </w:r>
     </w:p>
     <w:p>
       <w:r>
-        <w:t>Số gạo trong 8 thùng là: 25 × 8 = 200 (kg).</w:t>
+        <w:t>Số bút có trong cửa hàng là: 10 × 25 = 250 (cây).</w:t>
       </w:r>
       <w:r>
         <w:br/>
-        <w:t>Đáp số: 200 kg.</w:t>
+        <w:t>Đáp số: 250 cây bút.</w:t>
       </w:r>
     </w:p>
     <w:p>
@@ -43,573 +343,300 @@
     </w:p>
     <w:p>
       <w:r>
-        <w:t>200</w:t>
+        <w:t>250</w:t>
       </w:r>
     </w:p>
     <w:p>
       <w:r>
-        <w:br/>
-        <w:t>------------------------------------------------------------</w:t>
-      </w:r>
-      <w:r>
-        <w:br/>
+        <w:t>[BÀI TOÁN]</w:t>
       </w:r>
     </w:p>
     <w:p>
       <w:r>
-        <w:t>[BÀI TOÁN]</w:t>
+        <w:t>Một công nhân làm việc trong 4 giờ được 20 sản phẩm. Hỏi nếu làm việc trong 7 giờ thì công nhân đó làm được bao nhiêu sản phẩm?</w:t>
       </w:r>
     </w:p>
     <w:p>
       <w:r>
-        <w:t>Ba bạn chia đều 36 quyển vở. Hỏi mỗi bạn được mấy quyển vở?</w:t>
+        <w:t>[ĐÁP ÁN MẪU]</w:t>
       </w:r>
     </w:p>
     <w:p>
       <w:r>
-        <w:br/>
-        <w:t>[ĐÁP ÁN MẪU]</w:t>
+        <w:t>Mỗi giờ công nhân đó làm được: 20 : 4 = 5 (sản phẩm). Trong 7 giờ làm được: 5 × 7 = 35 (sản phẩm). Đáp số: 35 sản phẩm.</w:t>
       </w:r>
     </w:p>
     <w:p>
       <w:r>
-        <w:t>Mỗi bạn được số vở là: 36 : 3 = 12 (quyển).</w:t>
-      </w:r>
-      <w:r>
-        <w:br/>
-        <w:t>Đáp số: 12 quyển.</w:t>
+        <w:t>[ĐÁP SỐ]</w:t>
       </w:r>
     </w:p>
     <w:p>
       <w:r>
-        <w:br/>
-        <w:t>[ĐÁP SỐ]</w:t>
+        <w:t>35</w:t>
       </w:r>
     </w:p>
     <w:p>
       <w:r>
-        <w:t>12</w:t>
+        <w:lastRenderedPageBreak/>
+        <w:t>[BÀI TOÁN]</w:t>
       </w:r>
     </w:p>
     <w:p>
       <w:r>
-        <w:br/>
-        <w:t>------------------------------------------------------------</w:t>
-      </w:r>
-      <w:r>
-        <w:br/>
+        <w:t>Một đội xe chở hàng, trong 5 chuyến xe chở được 1500 kg hàng. Hỏi nếu đội đó thực hiện 8 chuyến xe như thế thì chở được bao nhiêu ki-lô-gam hàng?</w:t>
       </w:r>
     </w:p>
     <w:p>
       <w:r>
-        <w:t>[BÀI TOÁN]</w:t>
+        <w:t>[ĐÁP ÁN MẪU]</w:t>
       </w:r>
     </w:p>
     <w:p>
       <w:r>
-        <w:t>Một đội công nhân làm xong 48m đường trong 6 ngày. Hỏi trung bình mỗi ngày đội đó làm được bao nhiêu mét đường?</w:t>
+        <w:t>Mỗi chuyến xe chở được: 1500 : 5 = 300 (kg). Trong 8 chuyến xe chở được: 300 × 8 = 2400 (kg). Đáp số: 2400 kg.</w:t>
       </w:r>
     </w:p>
     <w:p>
       <w:r>
-        <w:br/>
-        <w:t>[ĐÁP ÁN MẪU]</w:t>
+        <w:t>[ĐÁP SỐ]</w:t>
       </w:r>
     </w:p>
     <w:p>
       <w:r>
-        <w:lastRenderedPageBreak/>
-        <w:t>Mỗi ngày làm được: 48 : 6 = 8 (m).</w:t>
-      </w:r>
-      <w:r>
-        <w:br/>
-        <w:t>Đáp số: 8 mét.</w:t>
+        <w:t>2400</w:t>
       </w:r>
     </w:p>
     <w:p>
       <w:r>
-        <w:br/>
-        <w:t>[ĐÁP SỐ]</w:t>
+        <w:t>[BÀI TOÁN]</w:t>
       </w:r>
     </w:p>
     <w:p>
       <w:r>
-        <w:t>8</w:t>
+        <w:t>Mua 9 mét vải hết 360000 đồng. Hỏi mua 15 mét vải như thế hết bao nhiêu tiền?</w:t>
       </w:r>
     </w:p>
     <w:p>
       <w:r>
-        <w:br/>
-        <w:t>------------------------------------------------------------</w:t>
-      </w:r>
-      <w:r>
-        <w:br/>
+        <w:t>[ĐÁP ÁN MẪU]</w:t>
       </w:r>
     </w:p>
     <w:p>
       <w:r>
-        <w:t>[BÀI TOÁN]</w:t>
+        <w:t>Giá 1 mét vải là: 360000 : 9 = 40000 (đồng). Mua 15 mét vải hết: 40000 × 15 = 600000 (đồng). Đáp số: 600000 đồng.</w:t>
       </w:r>
     </w:p>
     <w:p>
       <w:r>
-        <w:t>Mua 4 hộp sữa, mỗi hộp giá 8 000 đồng. Hỏi mua tất cả hết bao nhiêu tiền?</w:t>
+        <w:t>[ĐÁP SỐ]</w:t>
       </w:r>
     </w:p>
     <w:p>
       <w:r>
-        <w:br/>
-        <w:t>[ĐÁP ÁN MẪU]</w:t>
+        <w:t>600000</w:t>
       </w:r>
     </w:p>
     <w:p>
       <w:r>
-        <w:t>Tổng số tiền phải trả là: 8 000 × 4 = 32 000 (đồng).</w:t>
-      </w:r>
-      <w:r>
-        <w:br/>
-        <w:t>Đáp số: 32 000 đồng.</w:t>
+        <w:t xml:space="preserve"> [BÀI TOÁN] Một vòi nước chảy vào bể trong 6 phút được 120 lít nước. Hỏi nếu vòi đó chảy trong 11 phút thì được bao nhiêu lít nước?</w:t>
       </w:r>
     </w:p>
     <w:p>
       <w:r>
-        <w:br/>
-        <w:t>[ĐÁP SỐ]</w:t>
+        <w:t>[ĐÁP ÁN MẪU]</w:t>
       </w:r>
     </w:p>
     <w:p>
       <w:r>
-        <w:t>32000</w:t>
+        <w:t>Mỗi phút vòi đó chảy được: 120 : 6 = 20 (lít). Trong 11 phút chảy được: 20 × 11 = 220 (lít). Đáp số: 220 lít.</w:t>
       </w:r>
     </w:p>
     <w:p>
       <w:r>
-        <w:br/>
-        <w:t>------------------------------------------------------------</w:t>
-      </w:r>
-      <w:r>
-        <w:br/>
+        <w:t>[ĐÁP SỐ]</w:t>
       </w:r>
     </w:p>
     <w:p>
       <w:r>
-        <w:t>[BÀI TOÁN]</w:t>
+        <w:t>220</w:t>
       </w:r>
     </w:p>
     <w:p>
       <w:r>
-        <w:t>Có 5 bao đường, mỗi bao nặng 25 kg. Hỏi tất cả số đường đó nặng bao nhiêu ki-lô-gam?</w:t>
+        <w:t>[BÀI TOÁN] Có 3 bao gạo nặng tổng cộng 96 kg. Hỏi 10 bao gạo như thế nặng bao nhiêu ki-lô-gam?</w:t>
       </w:r>
     </w:p>
     <w:p>
       <w:r>
-        <w:br/>
         <w:t>[ĐÁP ÁN MẪU]</w:t>
       </w:r>
     </w:p>
     <w:p>
       <w:r>
-        <w:t>Tổng số ki-lô-gam đường là: 25 × 5 = 125 (kg).</w:t>
-      </w:r>
-      <w:r>
-        <w:br/>
-        <w:t>Đáp số: 125 kg.</w:t>
+        <w:t>Mỗi bao gạo nặng: 96 : 3 = 32 (kg). 10 bao gạo nặng: 32 × 10 = 320 (kg). Đáp số: 320 kg.</w:t>
       </w:r>
     </w:p>
     <w:p>
       <w:r>
-        <w:br/>
         <w:t>[ĐÁP SỐ]</w:t>
       </w:r>
     </w:p>
     <w:p>
       <w:r>
-        <w:t>125</w:t>
+        <w:t>320</w:t>
       </w:r>
     </w:p>
     <w:p>
       <w:r>
-        <w:br/>
-        <w:t>------------------------------------------------------------</w:t>
-      </w:r>
-      <w:r>
-        <w:br/>
+        <w:lastRenderedPageBreak/>
+        <w:t xml:space="preserve"> [BÀI TOÁN]</w:t>
       </w:r>
     </w:p>
     <w:p>
       <w:r>
-        <w:lastRenderedPageBreak/>
-        <w:t>[BÀI TOÁN]</w:t>
+        <w:t>Một người bán cam, cứ 10 quả cam bán được 50000 đồng. Hỏi nếu người đó bán được 35 quả cam thì thu được bao nhiêu tiền?</w:t>
       </w:r>
     </w:p>
     <w:p>
       <w:r>
-        <w:t>Một tấm vải dài 27m, người ta cắt thành 9 đoạn bằng nhau. Hỏi mỗi đoạn dài bao nhiêu mét?</w:t>
+        <w:t>[ĐÁP ÁN MẪU]</w:t>
       </w:r>
     </w:p>
     <w:p>
       <w:r>
-        <w:br/>
-        <w:t>[ĐÁP ÁN MẪU]</w:t>
+        <w:t>Giá 1 quả cam là: 50000 : 10 = 5000 (đồng). 35 quả cam thu được: 5000 × 35 = 175000 (đồng). Đáp số: 175000 đồng.</w:t>
       </w:r>
     </w:p>
     <w:p>
       <w:r>
-        <w:t>Chiều dài mỗi đoạn là: 27 : 9 = 3 (m).</w:t>
-      </w:r>
-      <w:r>
-        <w:br/>
-        <w:t>Đáp số: 3 mét.</w:t>
+        <w:t>[ĐÁP SỐ]</w:t>
       </w:r>
     </w:p>
     <w:p>
       <w:r>
-        <w:br/>
-        <w:t>[ĐÁP SỐ]</w:t>
+        <w:t>175000</w:t>
       </w:r>
     </w:p>
     <w:p>
       <w:r>
-        <w:t>3</w:t>
+        <w:t>[BÀI TOÁN]</w:t>
       </w:r>
     </w:p>
     <w:p>
       <w:r>
-        <w:br/>
-        <w:t>------------------------------------------------------------</w:t>
-      </w:r>
-      <w:r>
-        <w:br/>
+        <w:t>Một máy bơm bơm 800 lít dầu trong 5 phút. Hỏi trong 9 phút máy bơm đó bơm được bao nhiêu lít dầu?</w:t>
       </w:r>
     </w:p>
     <w:p>
       <w:r>
-        <w:t>[BÀI TOÁN]</w:t>
+        <w:t>[ĐÁP ÁN MẪU]</w:t>
       </w:r>
     </w:p>
     <w:p>
       <w:r>
-        <w:t>Mỗi cuốn sách giá 15 000 đồng. Lan mua 6 cuốn. Hỏi Lan phải trả bao nhiêu tiền?</w:t>
+        <w:t>Mỗi phút máy bơm bơm được: 800 : 5 = 160 (lít). Trong 9 phút bơm được: 160 × 9 = 1440 (lít). Đáp số: 1440 lít.</w:t>
       </w:r>
     </w:p>
     <w:p>
       <w:r>
-        <w:br/>
-        <w:t>[ĐÁP ÁN MẪU]</w:t>
+        <w:t>[ĐÁP SỐ]</w:t>
       </w:r>
     </w:p>
     <w:p>
       <w:r>
-        <w:t>Số tiền Lan phải trả là: 15 000 × 6 = 90 000 (đồng).</w:t>
-      </w:r>
-      <w:r>
-        <w:br/>
-        <w:t>Đáp số: 90 000 đồng.</w:t>
+        <w:t>1440</w:t>
       </w:r>
     </w:p>
     <w:p>
       <w:r>
-        <w:br/>
-        <w:t>[ĐÁP SỐ]</w:t>
+        <w:t>[BÀI TOÁN]</w:t>
       </w:r>
     </w:p>
     <w:p>
       <w:r>
-        <w:t>90000</w:t>
+        <w:t>Một cửa hàng bán 15 cái áo sơ mi hết 1800000 đồng. Hỏi nếu bán 10 cái áo sơ mi như thế thì thu được bao nhiêu tiền?</w:t>
       </w:r>
     </w:p>
     <w:p>
       <w:r>
-        <w:br/>
-        <w:t>------------------------------------------------------------</w:t>
-      </w:r>
-      <w:r>
-        <w:br/>
+        <w:t>[ĐÁP ÁN MẪU]</w:t>
       </w:r>
     </w:p>
     <w:p>
       <w:r>
-        <w:t>[BÀI TOÁN]</w:t>
+        <w:t>Giá 1 cái áo sơ mi là: 1800000 : 15 = 120000 (đồng). 10 cái áo sơ mi thu được: 120000 × 10 = 1200000 (đồng). Đáp số: 1200000 đồng.</w:t>
       </w:r>
     </w:p>
     <w:p>
       <w:r>
-        <w:t>Một chiếc ô tô đi được 120 km trong 3 giờ. Hỏi trung bình mỗi giờ ô tô đi được bao nhiêu ki-lô-mét?</w:t>
+        <w:t>[ĐÁP SỐ]</w:t>
       </w:r>
     </w:p>
     <w:p>
       <w:r>
-        <w:br/>
-        <w:t>[ĐÁP ÁN MẪU]</w:t>
+        <w:t>1200000</w:t>
       </w:r>
     </w:p>
     <w:p>
       <w:r>
-        <w:t>Mỗi giờ ô tô đi được: 120 : 3 = 40 (km).</w:t>
-      </w:r>
-      <w:r>
-        <w:br/>
-        <w:t>Đáp số: 40 km.</w:t>
+        <w:t>[BÀI TOÁN]</w:t>
       </w:r>
     </w:p>
     <w:p>
       <w:r>
-        <w:lastRenderedPageBreak/>
-        <w:br/>
-        <w:t>[ĐÁP SỐ]</w:t>
+        <w:t>Cứ 2 giờ ô tô đi được 140 km. Hỏi để đi quãng đường dài 490 km thì ô tô đó cần đi trong bao nhiêu giờ?</w:t>
       </w:r>
     </w:p>
     <w:p>
       <w:r>
-        <w:t>40</w:t>
+        <w:t>[ĐÁP ÁN MẪU]</w:t>
       </w:r>
     </w:p>
     <w:p>
       <w:r>
-        <w:br/>
-        <w:t>------------------------------------------------------------</w:t>
-      </w:r>
-      <w:r>
-        <w:br/>
+        <w:lastRenderedPageBreak/>
+        <w:t>Mỗi giờ ô tô đi được: 140 : 2 = 70 (km). Thời gian để đi 490 km là: 490 : 70 = 7 (giờ). Đáp số: 7 giờ.</w:t>
       </w:r>
     </w:p>
     <w:p>
       <w:r>
-        <w:t>[BÀI TOÁN]</w:t>
+        <w:t>[ĐÁP SỐ]</w:t>
       </w:r>
     </w:p>
     <w:p>
       <w:r>
-        <w:t>Một cửa hàng bán 6 hộp bánh, mỗi hộp có 12 cái bánh. Hỏi cửa hàng có tất cả bao nhiêu cái bánh?</w:t>
+        <w:t>7</w:t>
       </w:r>
     </w:p>
     <w:p>
       <w:r>
-        <w:br/>
-        <w:t>[ĐÁP ÁN MẪU]</w:t>
+        <w:t>[BÀI TOÁN]</w:t>
       </w:r>
     </w:p>
     <w:p>
       <w:r>
-        <w:t>Tổng số bánh là: 12 × 6 = 72 (cái).</w:t>
-      </w:r>
-      <w:r>
-        <w:br/>
-        <w:t>Đáp số: 72 cái.</w:t>
+        <w:t>Một mảnh đất hình chữ nhật có chu vi là 180 m, chiều dài hơn chiều rộng 20 m. Tính diện tích của mảnh đất đó.</w:t>
       </w:r>
     </w:p>
     <w:p>
       <w:r>
-        <w:br/>
-        <w:t>[ĐÁP SỐ]</w:t>
+        <w:t>[ĐÁP ÁN MẪU]</w:t>
       </w:r>
     </w:p>
     <w:p>
       <w:r>
-        <w:t>72</w:t>
+        <w:t>Nửa chu vi của mảnh đất là: 180 : 2 = 90 (m). Chiều dài của mảnh đất là: (90 + 20) : 2 = 55 (m). Chiều rộng của mảnh đất là: 90 – 55 = 35 (m). Diện tích mảnh đất là: 55 × 35 = 1925 (m). Đáp số: 1925 m.</w:t>
       </w:r>
     </w:p>
     <w:p>
       <w:r>
-        <w:br/>
-        <w:t>------------------------------------------------------------</w:t>
-      </w:r>
-      <w:r>
-        <w:br/>
+        <w:t>[ĐÁP SỐ]</w:t>
       </w:r>
     </w:p>
     <w:p>
       <w:r>
-        <w:t>[BÀI TOÁN]</w:t>
-      </w:r>
-    </w:p>
-    <w:p>
-      <w:r>
-        <w:t>Một gói bút có 10 cây. Cửa hàng nhập về 25 gói bút. Hỏi cửa hàng có tất cả bao nhiêu cây bút?</w:t>
-      </w:r>
-    </w:p>
-    <w:p>
-      <w:r>
-        <w:br/>
-        <w:t>[ĐÁP ÁN MẪU]</w:t>
-      </w:r>
-    </w:p>
-    <w:p>
-      <w:r>
-        <w:t>Số bút có trong cửa hàng là: 10 × 25 = 250 (cây).</w:t>
-      </w:r>
-      <w:r>
-        <w:br/>
-        <w:t>Đáp số: 250 cây bút.</w:t>
-      </w:r>
-    </w:p>
-    <w:p>
-      <w:r>
-        <w:br/>
-        <w:t>[ĐÁP SỐ]</w:t>
-      </w:r>
-    </w:p>
-    <w:p>
-      <w:r>
-        <w:t>250</w:t>
-      </w:r>
-    </w:p>
-    <w:p>
-      <w:r>
-        <w:br/>
-        <w:t>------------------------------------------------------------</w:t>
-      </w:r>
-    </w:p>
-    <w:p>
-      <w:r>
-        <w:lastRenderedPageBreak/>
-        <w:t>1. [BÀI TOÁN] Một công nhân làm việc trong 4 giờ được 20 sản phẩm. Hỏi nếu làm việc trong 7 giờ thì công nhân đó làm được bao nhiêu sản phẩm?</w:t>
-      </w:r>
-    </w:p>
-    <w:p>
-      <w:r>
-        <w:t>[ĐÁP ÁN MẪU] Mỗi giờ công nhân đó làm được: 20 : 4 = 5 (sản phẩm). Trong 7 giờ làm được: 5 × 7 = 35 (sản phẩm). Đáp số: 35 sản phẩm.</w:t>
-      </w:r>
-    </w:p>
-    <w:p>
-      <w:r>
-        <w:t>[ĐÁP SỐ] 35</w:t>
-      </w:r>
-    </w:p>
-    <w:p>
-      <w:r>
-        <w:t>2. [BÀI TOÁN] Một đội xe chở hàng, trong 5 chuyến xe chở được 1500 kg hàng. Hỏi nếu đội đó thực hiện 8 chuyến xe như thế thì chở được bao nhiêu ki-lô-gam hàng?</w:t>
-      </w:r>
-    </w:p>
-    <w:p>
-      <w:r>
-        <w:t>[ĐÁP ÁN MẪU] Mỗi chuyến xe chở được: 1500 : 5 = 300 (kg). Trong 8 chuyến xe chở được: 300 × 8 = 2400 (kg). Đáp số: 2400 kg.</w:t>
-      </w:r>
-    </w:p>
-    <w:p>
-      <w:r>
-        <w:t>[ĐÁP SỐ] 2400</w:t>
-      </w:r>
-    </w:p>
-    <w:p>
-      <w:r>
-        <w:t>3. [BÀI TOÁN] Mua 9 mét vải hết 360000 đồng. Hỏi mua 15 mét vải như thế hết bao nhiêu tiền?</w:t>
-      </w:r>
-    </w:p>
-    <w:p>
-      <w:r>
-        <w:t>[ĐÁP ÁN MẪU] Giá 1 mét vải là: 360000 : 9 = 40000 (đồng). Mua 15 mét vải hết: 40000 × 15 = 600000 (đồng). Đáp số: 600000 đồng.</w:t>
-      </w:r>
-    </w:p>
-    <w:p>
-      <w:r>
-        <w:t>[ĐÁP SỐ] 600000</w:t>
-      </w:r>
-    </w:p>
-    <w:p>
-      <w:r>
-        <w:t>4. [BÀI TOÁN] Một vòi nước chảy vào bể trong 6 phút được 120 lít nước. Hỏi nếu vòi đó chảy trong 11 phút thì được bao nhiêu lít nước?</w:t>
-      </w:r>
-    </w:p>
-    <w:p>
-      <w:r>
-        <w:t>[ĐÁP ÁN MẪU] Mỗi phút vòi đó chảy được: 120 : 6 = 20 (lít). Trong 11 phút chảy được: 20 × 11 = 220 (lít). Đáp số: 220 lít.</w:t>
-      </w:r>
-    </w:p>
-    <w:p>
-      <w:r>
-        <w:t>[ĐÁP SỐ] 220</w:t>
-      </w:r>
-    </w:p>
-    <w:p>
-      <w:r>
-        <w:t>5. [BÀI TOÁN] Có 3 bao gạo nặng tổng cộng 96 kg. Hỏi 10 bao gạo như thế nặng bao nhiêu ki-lô-gam?</w:t>
-      </w:r>
-    </w:p>
-    <w:p>
-      <w:r>
-        <w:t>[ĐÁP ÁN MẪU] Mỗi bao gạo nặng: 96 : 3 = 32 (kg). 10 bao gạo nặng: 32 × 10 = 320 (kg). Đáp số: 320 kg.</w:t>
-      </w:r>
-    </w:p>
-    <w:p>
-      <w:r>
-        <w:t>[ĐÁP SỐ] 320</w:t>
-      </w:r>
-    </w:p>
-    <w:p>
-      <w:r>
-        <w:t>6. [BÀI TOÁN] Một người bán cam, cứ 10 quả cam bán được 50000 đồng. Hỏi nếu người đó bán được 35 quả cam thì thu được bao nhiêu tiền?</w:t>
-      </w:r>
-    </w:p>
-    <w:p>
-      <w:r>
-        <w:t>[ĐÁP ÁN MẪU] Giá 1 quả cam là: 50000 : 10 = 5000 (đồng). 35 quả cam thu được: 5000 × 35 = 175000 (đồng). Đáp số: 175000 đồng.</w:t>
-      </w:r>
-    </w:p>
-    <w:p>
-      <w:r>
-        <w:t>[ĐÁP SỐ] 175000</w:t>
-      </w:r>
-    </w:p>
-    <w:p>
-      <w:r>
-        <w:lastRenderedPageBreak/>
-        <w:t>7. [BÀI TOÁN] Một máy bơm bơm 800 lít dầu trong 5 phút. Hỏi trong 9 phút máy bơm đó bơm được bao nhiêu lít dầu?</w:t>
-      </w:r>
-    </w:p>
-    <w:p>
-      <w:r>
-        <w:t>[ĐÁP ÁN MẪU] Mỗi phút máy bơm bơm được: 800 : 5 = 160 (lít). Trong 9 phút bơm được: 160 × 9 = 1440 (lít). Đáp số: 1440 lít.</w:t>
-      </w:r>
-    </w:p>
-    <w:p>
-      <w:r>
-        <w:t>[ĐÁP SỐ] 1440</w:t>
-      </w:r>
-    </w:p>
-    <w:p>
-      <w:r>
-        <w:t>8. [BÀI TOÁN] Một cửa hàng bán 15 cái áo sơ mi hết 1800000 đồng. Hỏi nếu bán 10 cái áo sơ mi như thế thì thu được bao nhiêu tiền?</w:t>
-      </w:r>
-    </w:p>
-    <w:p>
-      <w:r>
-        <w:t>[ĐÁP ÁN MẪU] Giá 1 cái áo sơ mi là: 1800000 : 15 = 120000 (đồng). 10 cái áo sơ mi thu được: 120000 × 10 = 1200000 (đồng). Đáp số: 1200000 đồng.</w:t>
-      </w:r>
-    </w:p>
-    <w:p>
-      <w:r>
-        <w:t>[ĐÁP SỐ] 1200000</w:t>
-      </w:r>
-    </w:p>
-    <w:p>
-      <w:r>
-        <w:t>9. [BÀI TOÁN] Cứ 2 giờ ô tô đi được 140 km. Hỏi để đi quãng đường dài 490 km thì ô tô đó cần đi trong bao nhiêu giờ?</w:t>
-      </w:r>
-    </w:p>
-    <w:p>
-      <w:r>
-        <w:t>[ĐÁP ÁN MẪU] Mỗi giờ ô tô đi được: 140 : 2 = 70 (km). Thời gian để đi 490 km là: 490 : 70 = 7 (giờ). Đáp số: 7 giờ.</w:t>
-      </w:r>
-    </w:p>
-    <w:p>
-      <w:r>
-        <w:t>[ĐÁP SỐ] 7</w:t>
-      </w:r>
-    </w:p>
-    <w:p>
-      <w:r>
-        <w:t>10. [BÀI TOÁN] Một mảnh đất hình chữ nhật có chu vi là 180 m, chiều dài hơn chiều rộng 20 m. Tính diện tích của mảnh đất đó.</w:t>
-      </w:r>
-    </w:p>
-    <w:p>
-      <w:r>
-        <w:t>[ĐÁP ÁN MẪU] Nửa chu vi của mảnh đất là: 180 : 2 = 90 (m). Chiều dài của mảnh đất là: (90 + 20) : 2 = 55 (m). Chiều rộng của mảnh đất là: 90 – 55 = 35 (m). Diện tích mảnh đất là: 55 × 35 = 1925 (m). Đáp số: 1925 m.</w:t>
-      </w:r>
-    </w:p>
-    <w:p>
-      <w:r>
-        <w:t>[ĐÁP SỐ] 1925</w:t>
+        <w:t>1925</w:t>
       </w:r>
     </w:p>
     <w:p>
@@ -1433,6 +1460,7 @@
   <w:style w:type="character" w:default="1" w:styleId="DefaultParagraphFont">
     <w:name w:val="Default Paragraph Font"/>
     <w:uiPriority w:val="1"/>
+    <w:semiHidden/>
     <w:unhideWhenUsed/>
   </w:style>
   <w:style w:type="table" w:default="1" w:styleId="TableNormal">

</xml_diff>